<commit_message>
Added Logical DFD and inserted in the Software Design Document
</commit_message>
<xml_diff>
--- a/docs/Software-Design-Document.docx
+++ b/docs/Software-Design-Document.docx
@@ -355,14 +355,14 @@
         <w:tblLook w:noHBand="0" w:noVBand="0" w:firstColumn="1" w:lastRow="0" w:lastColumn="0" w:firstRow="1" w:val="00a0"/>
       </w:tblPr>
       <w:tblGrid>
-        <w:gridCol w:w="2942"/>
-        <w:gridCol w:w="6303"/>
+        <w:gridCol w:w="2941"/>
+        <w:gridCol w:w="6304"/>
       </w:tblGrid>
       <w:tr>
         <w:trPr/>
         <w:tc>
           <w:tcPr>
-            <w:tcW w:w="2942" w:type="dxa"/>
+            <w:tcW w:w="2941" w:type="dxa"/>
             <w:tcBorders>
               <w:top w:val="single" w:sz="4" w:space="0" w:color="000000"/>
               <w:start w:val="single" w:sz="4" w:space="0" w:color="000000"/>
@@ -384,7 +384,7 @@
         </w:tc>
         <w:tc>
           <w:tcPr>
-            <w:tcW w:w="6303" w:type="dxa"/>
+            <w:tcW w:w="6304" w:type="dxa"/>
             <w:tcBorders>
               <w:top w:val="single" w:sz="4" w:space="0" w:color="000000"/>
               <w:start w:val="single" w:sz="4" w:space="0" w:color="000000"/>
@@ -409,7 +409,7 @@
         <w:trPr/>
         <w:tc>
           <w:tcPr>
-            <w:tcW w:w="2942" w:type="dxa"/>
+            <w:tcW w:w="2941" w:type="dxa"/>
             <w:tcBorders>
               <w:top w:val="single" w:sz="4" w:space="0" w:color="000000"/>
               <w:start w:val="single" w:sz="4" w:space="0" w:color="000000"/>
@@ -431,7 +431,7 @@
         </w:tc>
         <w:tc>
           <w:tcPr>
-            <w:tcW w:w="6303" w:type="dxa"/>
+            <w:tcW w:w="6304" w:type="dxa"/>
             <w:tcBorders>
               <w:top w:val="single" w:sz="4" w:space="0" w:color="000000"/>
               <w:start w:val="single" w:sz="4" w:space="0" w:color="000000"/>
@@ -456,7 +456,7 @@
         <w:trPr/>
         <w:tc>
           <w:tcPr>
-            <w:tcW w:w="2942" w:type="dxa"/>
+            <w:tcW w:w="2941" w:type="dxa"/>
             <w:tcBorders>
               <w:top w:val="single" w:sz="4" w:space="0" w:color="000000"/>
               <w:start w:val="single" w:sz="4" w:space="0" w:color="000000"/>
@@ -478,7 +478,7 @@
         </w:tc>
         <w:tc>
           <w:tcPr>
-            <w:tcW w:w="6303" w:type="dxa"/>
+            <w:tcW w:w="6304" w:type="dxa"/>
             <w:tcBorders>
               <w:top w:val="single" w:sz="4" w:space="0" w:color="000000"/>
               <w:start w:val="single" w:sz="4" w:space="0" w:color="000000"/>
@@ -503,7 +503,7 @@
         <w:trPr/>
         <w:tc>
           <w:tcPr>
-            <w:tcW w:w="2942" w:type="dxa"/>
+            <w:tcW w:w="2941" w:type="dxa"/>
             <w:tcBorders>
               <w:top w:val="single" w:sz="4" w:space="0" w:color="000000"/>
               <w:start w:val="single" w:sz="4" w:space="0" w:color="000000"/>
@@ -525,7 +525,7 @@
         </w:tc>
         <w:tc>
           <w:tcPr>
-            <w:tcW w:w="6303" w:type="dxa"/>
+            <w:tcW w:w="6304" w:type="dxa"/>
             <w:tcBorders>
               <w:top w:val="single" w:sz="4" w:space="0" w:color="000000"/>
               <w:start w:val="single" w:sz="4" w:space="0" w:color="000000"/>
@@ -729,19 +729,7 @@
             </w:pPr>
             <w:r>
               <w:rPr/>
-              <w:t>16</w:t>
-            </w:r>
-            <w:r>
-              <w:rPr/>
-              <w:t>/0</w:t>
-            </w:r>
-            <w:r>
-              <w:rPr/>
-              <w:t>9</w:t>
-            </w:r>
-            <w:r>
-              <w:rPr/>
-              <w:t>/26</w:t>
+              <w:t>16/09/26</w:t>
             </w:r>
           </w:p>
         </w:tc>
@@ -1136,8 +1124,8 @@
         <w:tblLook w:noHBand="0" w:noVBand="0" w:firstColumn="0" w:lastRow="0" w:lastColumn="0" w:firstRow="0" w:val="0000"/>
       </w:tblPr>
       <w:tblGrid>
-        <w:gridCol w:w="2092"/>
-        <w:gridCol w:w="2127"/>
+        <w:gridCol w:w="2091"/>
+        <w:gridCol w:w="2128"/>
         <w:gridCol w:w="3119"/>
         <w:gridCol w:w="1860"/>
       </w:tblGrid>
@@ -1145,7 +1133,7 @@
         <w:trPr/>
         <w:tc>
           <w:tcPr>
-            <w:tcW w:w="2092" w:type="dxa"/>
+            <w:tcW w:w="2091" w:type="dxa"/>
             <w:tcBorders>
               <w:top w:val="single" w:sz="4" w:space="0" w:color="000000"/>
               <w:start w:val="single" w:sz="4" w:space="0" w:color="000000"/>
@@ -1167,7 +1155,7 @@
         </w:tc>
         <w:tc>
           <w:tcPr>
-            <w:tcW w:w="2127" w:type="dxa"/>
+            <w:tcW w:w="2128" w:type="dxa"/>
             <w:tcBorders>
               <w:top w:val="single" w:sz="4" w:space="0" w:color="000000"/>
               <w:start w:val="single" w:sz="4" w:space="0" w:color="000000"/>
@@ -1236,7 +1224,7 @@
         <w:trPr/>
         <w:tc>
           <w:tcPr>
-            <w:tcW w:w="2092" w:type="dxa"/>
+            <w:tcW w:w="2091" w:type="dxa"/>
             <w:tcBorders>
               <w:top w:val="single" w:sz="4" w:space="0" w:color="000000"/>
               <w:start w:val="single" w:sz="4" w:space="0" w:color="000000"/>
@@ -1257,7 +1245,7 @@
         </w:tc>
         <w:tc>
           <w:tcPr>
-            <w:tcW w:w="2127" w:type="dxa"/>
+            <w:tcW w:w="2128" w:type="dxa"/>
             <w:tcBorders>
               <w:top w:val="single" w:sz="4" w:space="0" w:color="000000"/>
               <w:start w:val="single" w:sz="4" w:space="0" w:color="000000"/>
@@ -1365,8 +1353,8 @@
       </w:tblPr>
       <w:tblGrid>
         <w:gridCol w:w="2093"/>
-        <w:gridCol w:w="2834"/>
-        <w:gridCol w:w="4253"/>
+        <w:gridCol w:w="2833"/>
+        <w:gridCol w:w="4254"/>
       </w:tblGrid>
       <w:tr>
         <w:trPr/>
@@ -1394,7 +1382,7 @@
         </w:tc>
         <w:tc>
           <w:tcPr>
-            <w:tcW w:w="2834" w:type="dxa"/>
+            <w:tcW w:w="2833" w:type="dxa"/>
             <w:tcBorders>
               <w:top w:val="single" w:sz="4" w:space="0" w:color="000000"/>
               <w:start w:val="single" w:sz="4" w:space="0" w:color="000000"/>
@@ -1416,7 +1404,7 @@
         </w:tc>
         <w:tc>
           <w:tcPr>
-            <w:tcW w:w="4253" w:type="dxa"/>
+            <w:tcW w:w="4254" w:type="dxa"/>
             <w:tcBorders>
               <w:top w:val="single" w:sz="4" w:space="0" w:color="000000"/>
               <w:start w:val="single" w:sz="4" w:space="0" w:color="000000"/>
@@ -1462,7 +1450,7 @@
         </w:tc>
         <w:tc>
           <w:tcPr>
-            <w:tcW w:w="2834" w:type="dxa"/>
+            <w:tcW w:w="2833" w:type="dxa"/>
             <w:tcBorders>
               <w:top w:val="single" w:sz="4" w:space="0" w:color="000000"/>
               <w:start w:val="single" w:sz="4" w:space="0" w:color="000000"/>
@@ -1483,7 +1471,7 @@
         </w:tc>
         <w:tc>
           <w:tcPr>
-            <w:tcW w:w="4253" w:type="dxa"/>
+            <w:tcW w:w="4254" w:type="dxa"/>
             <w:tcBorders>
               <w:top w:val="single" w:sz="4" w:space="0" w:color="000000"/>
               <w:start w:val="single" w:sz="4" w:space="0" w:color="000000"/>
@@ -1551,8 +1539,8 @@
         <w:gridCol w:w="959"/>
         <w:gridCol w:w="1984"/>
         <w:gridCol w:w="993"/>
-        <w:gridCol w:w="3968"/>
-        <w:gridCol w:w="1276"/>
+        <w:gridCol w:w="3967"/>
+        <w:gridCol w:w="1277"/>
       </w:tblGrid>
       <w:tr>
         <w:trPr/>
@@ -1624,7 +1612,7 @@
         </w:tc>
         <w:tc>
           <w:tcPr>
-            <w:tcW w:w="3968" w:type="dxa"/>
+            <w:tcW w:w="3967" w:type="dxa"/>
             <w:tcBorders>
               <w:top w:val="single" w:sz="4" w:space="0" w:color="000000"/>
               <w:start w:val="single" w:sz="4" w:space="0" w:color="000000"/>
@@ -1646,7 +1634,7 @@
         </w:tc>
         <w:tc>
           <w:tcPr>
-            <w:tcW w:w="1276" w:type="dxa"/>
+            <w:tcW w:w="1277" w:type="dxa"/>
             <w:tcBorders>
               <w:top w:val="single" w:sz="4" w:space="0" w:color="000000"/>
               <w:start w:val="single" w:sz="4" w:space="0" w:color="000000"/>
@@ -1731,7 +1719,7 @@
         </w:tc>
         <w:tc>
           <w:tcPr>
-            <w:tcW w:w="3968" w:type="dxa"/>
+            <w:tcW w:w="3967" w:type="dxa"/>
             <w:tcBorders>
               <w:top w:val="single" w:sz="4" w:space="0" w:color="000000"/>
               <w:start w:val="single" w:sz="4" w:space="0" w:color="000000"/>
@@ -1751,7 +1739,7 @@
         </w:tc>
         <w:tc>
           <w:tcPr>
-            <w:tcW w:w="1276" w:type="dxa"/>
+            <w:tcW w:w="1277" w:type="dxa"/>
             <w:tcBorders>
               <w:top w:val="single" w:sz="4" w:space="0" w:color="000000"/>
               <w:start w:val="single" w:sz="4" w:space="0" w:color="000000"/>
@@ -1817,8 +1805,8 @@
       <w:tblGrid>
         <w:gridCol w:w="3509"/>
         <w:gridCol w:w="2128"/>
-        <w:gridCol w:w="1841"/>
-        <w:gridCol w:w="1720"/>
+        <w:gridCol w:w="1840"/>
+        <w:gridCol w:w="1721"/>
       </w:tblGrid>
       <w:tr>
         <w:trPr/>
@@ -1868,7 +1856,7 @@
         </w:tc>
         <w:tc>
           <w:tcPr>
-            <w:tcW w:w="1841" w:type="dxa"/>
+            <w:tcW w:w="1840" w:type="dxa"/>
             <w:tcBorders>
               <w:top w:val="single" w:sz="4" w:space="0" w:color="000000"/>
               <w:start w:val="single" w:sz="4" w:space="0" w:color="000000"/>
@@ -1890,7 +1878,7 @@
         </w:tc>
         <w:tc>
           <w:tcPr>
-            <w:tcW w:w="1720" w:type="dxa"/>
+            <w:tcW w:w="1721" w:type="dxa"/>
             <w:tcBorders>
               <w:top w:val="single" w:sz="4" w:space="0" w:color="000000"/>
               <w:start w:val="single" w:sz="4" w:space="0" w:color="000000"/>
@@ -1957,7 +1945,7 @@
         </w:tc>
         <w:tc>
           <w:tcPr>
-            <w:tcW w:w="1841" w:type="dxa"/>
+            <w:tcW w:w="1840" w:type="dxa"/>
             <w:tcBorders>
               <w:top w:val="single" w:sz="4" w:space="0" w:color="000000"/>
               <w:start w:val="single" w:sz="4" w:space="0" w:color="000000"/>
@@ -1978,7 +1966,7 @@
         </w:tc>
         <w:tc>
           <w:tcPr>
-            <w:tcW w:w="1720" w:type="dxa"/>
+            <w:tcW w:w="1721" w:type="dxa"/>
             <w:tcBorders>
               <w:top w:val="single" w:sz="4" w:space="0" w:color="000000"/>
               <w:start w:val="single" w:sz="4" w:space="0" w:color="000000"/>
@@ -2079,15 +2067,6 @@
       <w:r>
         <w:rPr/>
         <w:t>&lt;Not all of the following sections may be applicable to the work being performed. If so, the preference would be to keep the section heading, but make a note such as “This section is not applicable for this process” and provide an explanation for the reasons why&gt;</w:t>
-      </w:r>
-    </w:p>
-    <w:p>
-      <w:pPr>
-        <w:pStyle w:val="Normal"/>
-        <w:rPr/>
-      </w:pPr>
-      <w:r>
-        <w:rPr/>
       </w:r>
     </w:p>
     <w:p>
@@ -2190,30 +2169,33 @@
           <w:r>
             <w:rPr>
               <w:rStyle w:val="IndexLink"/>
-              <w:webHidden/>
+              <w:vanish w:val="false"/>
             </w:rPr>
             <w:instrText xml:space="preserve"> TOC \z \o "1-3" \u \h</w:instrText>
           </w:r>
           <w:r>
             <w:rPr>
               <w:rStyle w:val="IndexLink"/>
-              <w:webHidden/>
+              <w:vanish w:val="false"/>
             </w:rPr>
             <w:fldChar w:fldCharType="separate"/>
           </w:r>
-          <w:hyperlink w:anchor="__RefHeading___Toc2654_579290053" w:tooltip="Introduction">
-            <w:r>
-              <w:rPr>
-                <w:rStyle w:val="IndexLink"/>
-                <w:webHidden/>
-              </w:rPr>
-              <w:t>1</w:t>
-              <w:tab/>
-              <w:t>Introduction</w:t>
-              <w:tab/>
-              <w:t>4</w:t>
-            </w:r>
-          </w:hyperlink>
+          <w:r>
+            <w:rPr>
+              <w:rStyle w:val="IndexLink"/>
+              <w:vanish w:val="false"/>
+            </w:rPr>
+            <w:t>1</w:t>
+          </w:r>
+          <w:r>
+            <w:rPr>
+              <w:vanish w:val="false"/>
+            </w:rPr>
+            <w:tab/>
+            <w:t>Introduction</w:t>
+            <w:tab/>
+            <w:t>4</w:t>
+          </w:r>
         </w:p>
         <w:p>
           <w:pPr>
@@ -2225,19 +2207,16 @@
             </w:tabs>
             <w:rPr/>
           </w:pPr>
-          <w:hyperlink w:anchor="__RefHeading___Toc2656_579290053" w:tooltip="Document Purpose">
-            <w:r>
-              <w:rPr>
-                <w:rStyle w:val="IndexLink"/>
-                <w:webHidden/>
-              </w:rPr>
-              <w:t>1.1</w:t>
-              <w:tab/>
-              <w:t>Document Purpose</w:t>
-              <w:tab/>
-              <w:t>4</w:t>
-            </w:r>
-          </w:hyperlink>
+          <w:r>
+            <w:rPr>
+              <w:vanish w:val="false"/>
+            </w:rPr>
+            <w:t>1.1</w:t>
+            <w:tab/>
+            <w:t>Document Purpose</w:t>
+            <w:tab/>
+            <w:t>4</w:t>
+          </w:r>
         </w:p>
         <w:p>
           <w:pPr>
@@ -2249,19 +2228,16 @@
             </w:tabs>
             <w:rPr/>
           </w:pPr>
-          <w:hyperlink w:anchor="__RefHeading___Toc2658_579290053" w:tooltip="Document Scope">
-            <w:r>
-              <w:rPr>
-                <w:rStyle w:val="IndexLink"/>
-                <w:webHidden/>
-              </w:rPr>
-              <w:t>1.2</w:t>
-              <w:tab/>
-              <w:t>Document Scope</w:t>
-              <w:tab/>
-              <w:t>4</w:t>
-            </w:r>
-          </w:hyperlink>
+          <w:r>
+            <w:rPr>
+              <w:vanish w:val="false"/>
+            </w:rPr>
+            <w:t>1.2</w:t>
+            <w:tab/>
+            <w:t>Document Scope</w:t>
+            <w:tab/>
+            <w:t>4</w:t>
+          </w:r>
         </w:p>
         <w:p>
           <w:pPr>
@@ -2273,19 +2249,16 @@
             </w:tabs>
             <w:rPr/>
           </w:pPr>
-          <w:hyperlink w:anchor="__RefHeading___Toc2660_579290053" w:tooltip="Database Design">
-            <w:r>
-              <w:rPr>
-                <w:rStyle w:val="IndexLink"/>
-                <w:webHidden/>
-              </w:rPr>
-              <w:t>2</w:t>
-              <w:tab/>
-              <w:t>Database Design</w:t>
-              <w:tab/>
-              <w:t>4</w:t>
-            </w:r>
-          </w:hyperlink>
+          <w:r>
+            <w:rPr>
+              <w:vanish w:val="false"/>
+            </w:rPr>
+            <w:t>2</w:t>
+            <w:tab/>
+            <w:t>Database Design</w:t>
+            <w:tab/>
+            <w:t>4</w:t>
+          </w:r>
         </w:p>
         <w:p>
           <w:pPr>
@@ -2297,19 +2270,16 @@
             </w:tabs>
             <w:rPr/>
           </w:pPr>
-          <w:hyperlink w:anchor="__RefHeading___Toc2662_579290053" w:tooltip="Entity Relation Diagram">
-            <w:r>
-              <w:rPr>
-                <w:rStyle w:val="IndexLink"/>
-                <w:webHidden/>
-              </w:rPr>
-              <w:t>2.1</w:t>
-              <w:tab/>
-              <w:t>Entity Relation Diagram</w:t>
-              <w:tab/>
-              <w:t>4</w:t>
-            </w:r>
-          </w:hyperlink>
+          <w:r>
+            <w:rPr>
+              <w:vanish w:val="false"/>
+            </w:rPr>
+            <w:t>2.1</w:t>
+            <w:tab/>
+            <w:t>Entity Relation Diagram</w:t>
+            <w:tab/>
+            <w:t>4</w:t>
+          </w:r>
         </w:p>
         <w:p>
           <w:pPr>
@@ -2321,19 +2291,16 @@
             </w:tabs>
             <w:rPr/>
           </w:pPr>
-          <w:hyperlink w:anchor="__RefHeading___Toc2664_579290053" w:tooltip="Logical Data Model">
-            <w:r>
-              <w:rPr>
-                <w:rStyle w:val="IndexLink"/>
-                <w:webHidden/>
-              </w:rPr>
-              <w:t>2.2</w:t>
-              <w:tab/>
-              <w:t>Logical Data Model</w:t>
-              <w:tab/>
-              <w:t>4</w:t>
-            </w:r>
-          </w:hyperlink>
+          <w:r>
+            <w:rPr>
+              <w:vanish w:val="false"/>
+            </w:rPr>
+            <w:t>2.2</w:t>
+            <w:tab/>
+            <w:t>Logical Data Model</w:t>
+            <w:tab/>
+            <w:t>4</w:t>
+          </w:r>
         </w:p>
         <w:p>
           <w:pPr>
@@ -2345,19 +2312,16 @@
             </w:tabs>
             <w:rPr/>
           </w:pPr>
-          <w:hyperlink w:anchor="__RefHeading___Toc2666_579290053" w:tooltip="Physical Data Model">
-            <w:r>
-              <w:rPr>
-                <w:rStyle w:val="IndexLink"/>
-                <w:webHidden/>
-              </w:rPr>
-              <w:t>2.3</w:t>
-              <w:tab/>
-              <w:t>Physical Data Model</w:t>
-              <w:tab/>
-              <w:t>4</w:t>
-            </w:r>
-          </w:hyperlink>
+          <w:r>
+            <w:rPr>
+              <w:vanish w:val="false"/>
+            </w:rPr>
+            <w:t>2.3</w:t>
+            <w:tab/>
+            <w:t>Physical Data Model</w:t>
+            <w:tab/>
+            <w:t>4</w:t>
+          </w:r>
         </w:p>
         <w:p>
           <w:pPr>
@@ -2369,19 +2333,16 @@
             </w:tabs>
             <w:rPr/>
           </w:pPr>
-          <w:hyperlink w:anchor="__RefHeading___Toc2668_579290053" w:tooltip="API Design">
-            <w:r>
-              <w:rPr>
-                <w:rStyle w:val="IndexLink"/>
-                <w:webHidden/>
-              </w:rPr>
-              <w:t>3</w:t>
-              <w:tab/>
-              <w:t>API Design</w:t>
-              <w:tab/>
-              <w:t>5</w:t>
-            </w:r>
-          </w:hyperlink>
+          <w:r>
+            <w:rPr>
+              <w:vanish w:val="false"/>
+            </w:rPr>
+            <w:t>3</w:t>
+            <w:tab/>
+            <w:t>API Design</w:t>
+            <w:tab/>
+            <w:t>5</w:t>
+          </w:r>
         </w:p>
         <w:p>
           <w:pPr>
@@ -2393,19 +2354,16 @@
             </w:tabs>
             <w:rPr/>
           </w:pPr>
-          <w:hyperlink w:anchor="__RefHeading___Toc2670_579290053" w:tooltip="Endpoints">
-            <w:r>
-              <w:rPr>
-                <w:rStyle w:val="IndexLink"/>
-                <w:webHidden/>
-              </w:rPr>
-              <w:t>3.1</w:t>
-              <w:tab/>
-              <w:t>Endpoints</w:t>
-              <w:tab/>
-              <w:t>5</w:t>
-            </w:r>
-          </w:hyperlink>
+          <w:r>
+            <w:rPr>
+              <w:vanish w:val="false"/>
+            </w:rPr>
+            <w:t>3.1</w:t>
+            <w:tab/>
+            <w:t>Endpoints</w:t>
+            <w:tab/>
+            <w:t>5</w:t>
+          </w:r>
         </w:p>
         <w:p>
           <w:pPr>
@@ -2417,19 +2375,16 @@
             </w:tabs>
             <w:rPr/>
           </w:pPr>
-          <w:hyperlink w:anchor="__RefHeading___Toc2672_579290053" w:tooltip="Payloads">
-            <w:r>
-              <w:rPr>
-                <w:rStyle w:val="IndexLink"/>
-                <w:webHidden/>
-              </w:rPr>
-              <w:t>3.2</w:t>
-              <w:tab/>
-              <w:t>Payloads</w:t>
-              <w:tab/>
-              <w:t>5</w:t>
-            </w:r>
-          </w:hyperlink>
+          <w:r>
+            <w:rPr>
+              <w:vanish w:val="false"/>
+            </w:rPr>
+            <w:t>3.2</w:t>
+            <w:tab/>
+            <w:t>Payloads</w:t>
+            <w:tab/>
+            <w:t>5</w:t>
+          </w:r>
         </w:p>
         <w:p>
           <w:pPr>
@@ -2441,19 +2396,16 @@
             </w:tabs>
             <w:rPr/>
           </w:pPr>
-          <w:hyperlink w:anchor="__RefHeading___Toc2674_579290053" w:tooltip="Authentication">
-            <w:r>
-              <w:rPr>
-                <w:rStyle w:val="IndexLink"/>
-                <w:webHidden/>
-              </w:rPr>
-              <w:t>3.3</w:t>
-              <w:tab/>
-              <w:t>Authentication</w:t>
-              <w:tab/>
-              <w:t>5</w:t>
-            </w:r>
-          </w:hyperlink>
+          <w:r>
+            <w:rPr>
+              <w:vanish w:val="false"/>
+            </w:rPr>
+            <w:t>3.3</w:t>
+            <w:tab/>
+            <w:t>Authentication</w:t>
+            <w:tab/>
+            <w:t>5</w:t>
+          </w:r>
         </w:p>
         <w:p>
           <w:pPr>
@@ -2465,19 +2417,16 @@
             </w:tabs>
             <w:rPr/>
           </w:pPr>
-          <w:hyperlink w:anchor="__RefHeading___Toc2676_579290053" w:tooltip="Component Design">
-            <w:r>
-              <w:rPr>
-                <w:rStyle w:val="IndexLink"/>
-                <w:webHidden/>
-              </w:rPr>
-              <w:t>4</w:t>
-              <w:tab/>
-              <w:t>Component Design</w:t>
-              <w:tab/>
-              <w:t>5</w:t>
-            </w:r>
-          </w:hyperlink>
+          <w:r>
+            <w:rPr>
+              <w:vanish w:val="false"/>
+            </w:rPr>
+            <w:t>4</w:t>
+            <w:tab/>
+            <w:t>Component Design</w:t>
+            <w:tab/>
+            <w:t>5</w:t>
+          </w:r>
         </w:p>
         <w:p>
           <w:pPr>
@@ -2489,19 +2438,16 @@
             </w:tabs>
             <w:rPr/>
           </w:pPr>
-          <w:hyperlink w:anchor="__RefHeading___Toc2678_579290053" w:tooltip="Services">
-            <w:r>
-              <w:rPr>
-                <w:rStyle w:val="IndexLink"/>
-                <w:webHidden/>
-              </w:rPr>
-              <w:t>4.1</w:t>
-              <w:tab/>
-              <w:t>Services</w:t>
-              <w:tab/>
-              <w:t>5</w:t>
-            </w:r>
-          </w:hyperlink>
+          <w:r>
+            <w:rPr>
+              <w:vanish w:val="false"/>
+            </w:rPr>
+            <w:t>4.1</w:t>
+            <w:tab/>
+            <w:t>Services</w:t>
+            <w:tab/>
+            <w:t>5</w:t>
+          </w:r>
         </w:p>
         <w:p>
           <w:pPr>
@@ -2513,19 +2459,16 @@
             </w:tabs>
             <w:rPr/>
           </w:pPr>
-          <w:hyperlink w:anchor="__RefHeading___Toc2680_579290053" w:tooltip="Modules">
-            <w:r>
-              <w:rPr>
-                <w:rStyle w:val="IndexLink"/>
-                <w:webHidden/>
-              </w:rPr>
-              <w:t>4.2</w:t>
-              <w:tab/>
-              <w:t>Modules</w:t>
-              <w:tab/>
-              <w:t>5</w:t>
-            </w:r>
-          </w:hyperlink>
+          <w:r>
+            <w:rPr>
+              <w:vanish w:val="false"/>
+            </w:rPr>
+            <w:t>4.2</w:t>
+            <w:tab/>
+            <w:t>Modules</w:t>
+            <w:tab/>
+            <w:t>5</w:t>
+          </w:r>
         </w:p>
         <w:p>
           <w:pPr>
@@ -2537,19 +2480,16 @@
             </w:tabs>
             <w:rPr/>
           </w:pPr>
-          <w:hyperlink w:anchor="__RefHeading___Toc2682_579290053" w:tooltip="Responsibilities">
-            <w:r>
-              <w:rPr>
-                <w:rStyle w:val="IndexLink"/>
-                <w:webHidden/>
-              </w:rPr>
-              <w:t>4.3</w:t>
-              <w:tab/>
-              <w:t>Responsibilities</w:t>
-              <w:tab/>
-              <w:t>5</w:t>
-            </w:r>
-          </w:hyperlink>
+          <w:r>
+            <w:rPr>
+              <w:vanish w:val="false"/>
+            </w:rPr>
+            <w:t>4.3</w:t>
+            <w:tab/>
+            <w:t>Responsibilities</w:t>
+            <w:tab/>
+            <w:t>5</w:t>
+          </w:r>
         </w:p>
         <w:p>
           <w:pPr>
@@ -2561,22 +2501,19 @@
             </w:tabs>
             <w:rPr/>
           </w:pPr>
-          <w:hyperlink w:anchor="__RefHeading___Toc2684_579290053" w:tooltip="Threat Model">
-            <w:r>
-              <w:rPr>
-                <w:rStyle w:val="IndexLink"/>
-                <w:webHidden/>
-              </w:rPr>
-              <w:t>4.3.1</w:t>
-              <w:tab/>
-              <w:t>Threat Model</w:t>
-              <w:tab/>
-              <w:t>5</w:t>
-            </w:r>
-          </w:hyperlink>
           <w:r>
             <w:rPr>
-              <w:rStyle w:val="IndexLink"/>
+              <w:vanish w:val="false"/>
+            </w:rPr>
+            <w:t>4.3.1</w:t>
+            <w:tab/>
+            <w:t>Threat Model</w:t>
+            <w:tab/>
+            <w:t>5</w:t>
+          </w:r>
+          <w:r>
+            <w:rPr>
+              <w:vanish w:val="false"/>
             </w:rPr>
             <w:fldChar w:fldCharType="end"/>
           </w:r>
@@ -2706,8 +2643,8 @@
         <w:rPr/>
       </w:pPr>
       <w:bookmarkStart w:id="0" w:name="__RefHeading___Toc2654_579290053"/>
-      <w:bookmarkStart w:id="1" w:name="_Toc239804408"/>
-      <w:bookmarkStart w:id="2" w:name="_Toc337656202"/>
+      <w:bookmarkStart w:id="1" w:name="_Toc337656202"/>
+      <w:bookmarkStart w:id="2" w:name="_Toc239804408"/>
       <w:bookmarkEnd w:id="0"/>
       <w:r>
         <w:rPr/>
@@ -2776,8 +2713,8 @@
         <w:rPr/>
       </w:pPr>
       <w:bookmarkStart w:id="7" w:name="__RefHeading___Toc2660_579290053"/>
-      <w:bookmarkStart w:id="8" w:name="_Toc239804408_Copy_1"/>
-      <w:bookmarkStart w:id="9" w:name="_Toc337656202_Copy_1"/>
+      <w:bookmarkStart w:id="8" w:name="_Toc337656202_Copy_1"/>
+      <w:bookmarkStart w:id="9" w:name="_Toc239804408_Copy_1"/>
       <w:bookmarkEnd w:id="7"/>
       <w:bookmarkEnd w:id="8"/>
       <w:bookmarkEnd w:id="9"/>
@@ -2846,6 +2783,113 @@
                       <a:avLst/>
                     </a:prstGeom>
                     <a:noFill/>
+                  </pic:spPr>
+                </pic:pic>
+              </a:graphicData>
+            </a:graphic>
+          </wp:anchor>
+        </w:drawing>
+      </w:r>
+    </w:p>
+    <w:p>
+      <w:pPr>
+        <w:pStyle w:val="Normal"/>
+        <w:rPr/>
+      </w:pPr>
+      <w:r>
+        <w:rPr/>
+      </w:r>
+    </w:p>
+    <w:p>
+      <w:pPr>
+        <w:pStyle w:val="Normal"/>
+        <w:rPr/>
+      </w:pPr>
+      <w:r>
+        <w:rPr/>
+      </w:r>
+      <w:r>
+        <w:br w:type="page"/>
+      </w:r>
+    </w:p>
+    <w:p>
+      <w:pPr>
+        <w:pStyle w:val="Normal"/>
+        <w:rPr/>
+      </w:pPr>
+      <w:r>
+        <w:rPr/>
+      </w:r>
+    </w:p>
+    <w:p>
+      <w:pPr>
+        <w:pStyle w:val="Heading2"/>
+        <w:rPr/>
+      </w:pPr>
+      <w:bookmarkStart w:id="11" w:name="__RefHeading___Toc2664_579290053"/>
+      <w:bookmarkEnd w:id="11"/>
+      <w:r>
+        <w:rPr/>
+        <w:t>Logical Data Model</w:t>
+      </w:r>
+    </w:p>
+    <w:p>
+      <w:pPr>
+        <w:pStyle w:val="Normal"/>
+        <w:rPr/>
+      </w:pPr>
+      <w:r>
+        <w:rPr/>
+      </w:r>
+    </w:p>
+    <w:p>
+      <w:pPr>
+        <w:pStyle w:val="Normal"/>
+        <w:rPr/>
+      </w:pPr>
+      <w:r>
+        <w:rPr/>
+        <w:drawing>
+          <wp:anchor distT="0" distB="0" distL="0" distR="0" simplePos="0" relativeHeight="3" behindDoc="0" locked="0" layoutInCell="0" allowOverlap="1">
+            <wp:simplePos x="0" y="0"/>
+            <wp:positionH relativeFrom="column">
+              <wp:align>center</wp:align>
+            </wp:positionH>
+            <wp:positionV relativeFrom="paragraph">
+              <wp:posOffset>635</wp:posOffset>
+            </wp:positionV>
+            <wp:extent cx="5731510" cy="3402965"/>
+            <wp:effectExtent l="0" t="0" r="0" b="0"/>
+            <wp:wrapSquare wrapText="largest"/>
+            <wp:docPr id="2" name="Image2"/>
+            <wp:cNvGraphicFramePr>
+              <a:graphicFrameLocks xmlns:a="http://schemas.openxmlformats.org/drawingml/2006/main" noChangeAspect="1"/>
+            </wp:cNvGraphicFramePr>
+            <a:graphic xmlns:a="http://schemas.openxmlformats.org/drawingml/2006/main">
+              <a:graphicData uri="http://schemas.openxmlformats.org/drawingml/2006/picture">
+                <pic:pic xmlns:pic="http://schemas.openxmlformats.org/drawingml/2006/picture">
+                  <pic:nvPicPr>
+                    <pic:cNvPr id="2" name="Image2"/>
+                    <pic:cNvPicPr>
+                      <a:picLocks noChangeAspect="1" noChangeArrowheads="1"/>
+                    </pic:cNvPicPr>
+                  </pic:nvPicPr>
+                  <pic:blipFill>
+                    <a:blip r:embed="rId9"/>
+                    <a:srcRect l="-92" t="-155" r="-92" b="-155"/>
+                    <a:stretch>
+                      <a:fillRect/>
+                    </a:stretch>
+                  </pic:blipFill>
+                  <pic:spPr bwMode="auto">
+                    <a:xfrm>
+                      <a:off x="0" y="0"/>
+                      <a:ext cx="5731510" cy="3402965"/>
+                    </a:xfrm>
+                    <a:prstGeom prst="rect">
+                      <a:avLst/>
+                    </a:prstGeom>
+                    <a:noFill/>
                     <a:ln>
                       <a:solidFill>
                         <a:srgbClr val="000000"/>
@@ -2882,54 +2926,6 @@
         <w:pStyle w:val="Heading2"/>
         <w:rPr/>
       </w:pPr>
-      <w:bookmarkStart w:id="11" w:name="__RefHeading___Toc2664_579290053"/>
-      <w:bookmarkEnd w:id="11"/>
-      <w:r>
-        <w:rPr/>
-        <w:t>Logical Data Model</w:t>
-      </w:r>
-    </w:p>
-    <w:p>
-      <w:pPr>
-        <w:pStyle w:val="Normal"/>
-        <w:rPr/>
-      </w:pPr>
-      <w:r>
-        <w:rPr/>
-      </w:r>
-    </w:p>
-    <w:p>
-      <w:pPr>
-        <w:pStyle w:val="Normal"/>
-        <w:rPr/>
-      </w:pPr>
-      <w:r>
-        <w:rPr/>
-      </w:r>
-    </w:p>
-    <w:p>
-      <w:pPr>
-        <w:pStyle w:val="Normal"/>
-        <w:rPr/>
-      </w:pPr>
-      <w:r>
-        <w:rPr/>
-      </w:r>
-    </w:p>
-    <w:p>
-      <w:pPr>
-        <w:pStyle w:val="Normal"/>
-        <w:rPr/>
-      </w:pPr>
-      <w:r>
-        <w:rPr/>
-      </w:r>
-    </w:p>
-    <w:p>
-      <w:pPr>
-        <w:pStyle w:val="Heading2"/>
-        <w:rPr/>
-      </w:pPr>
       <w:bookmarkStart w:id="12" w:name="__RefHeading___Toc2666_579290053"/>
       <w:bookmarkEnd w:id="12"/>
       <w:r>
@@ -2973,11 +2969,7 @@
       <w:bookmarkEnd w:id="13"/>
       <w:r>
         <w:rPr/>
-        <w:t>API</w:t>
-      </w:r>
-      <w:r>
-        <w:rPr/>
-        <w:t xml:space="preserve"> Design</w:t>
+        <w:t>API Design</w:t>
       </w:r>
     </w:p>
     <w:p>
@@ -3045,11 +3037,7 @@
       <w:bookmarkEnd w:id="17"/>
       <w:r>
         <w:rPr/>
-        <w:t>Component</w:t>
-      </w:r>
-      <w:r>
-        <w:rPr/>
-        <w:t xml:space="preserve"> Design</w:t>
+        <w:t>Component Design</w:t>
       </w:r>
     </w:p>
     <w:p>
@@ -3210,12 +3198,12 @@
       </w:r>
     </w:p>
     <w:sectPr>
-      <w:headerReference w:type="even" r:id="rId9"/>
-      <w:headerReference w:type="default" r:id="rId10"/>
-      <w:headerReference w:type="first" r:id="rId11"/>
-      <w:footerReference w:type="even" r:id="rId12"/>
-      <w:footerReference w:type="default" r:id="rId13"/>
-      <w:footerReference w:type="first" r:id="rId14"/>
+      <w:headerReference w:type="even" r:id="rId10"/>
+      <w:headerReference w:type="default" r:id="rId11"/>
+      <w:headerReference w:type="first" r:id="rId12"/>
+      <w:footerReference w:type="even" r:id="rId13"/>
+      <w:footerReference w:type="default" r:id="rId14"/>
+      <w:footerReference w:type="first" r:id="rId15"/>
       <w:type w:val="nextPage"/>
       <w:pgSz w:w="11906" w:h="16838"/>
       <w:pgMar w:left="1440" w:right="1440" w:gutter="0" w:header="709" w:top="1440" w:footer="709" w:bottom="1440"/>
@@ -3258,77 +3246,66 @@
     <w:r>
       <w:rPr>
         <w:rStyle w:val="PageNumber"/>
-        <w:rFonts w:ascii="Calibri" w:hAnsi="Calibri"/>
       </w:rPr>
       <w:fldChar w:fldCharType="begin"/>
     </w:r>
     <w:r>
       <w:rPr>
         <w:rStyle w:val="PageNumber"/>
-        <w:rFonts w:ascii="Calibri" w:hAnsi="Calibri"/>
       </w:rPr>
       <w:instrText xml:space="preserve"> PAGE </w:instrText>
     </w:r>
     <w:r>
       <w:rPr>
         <w:rStyle w:val="PageNumber"/>
-        <w:rFonts w:ascii="Calibri" w:hAnsi="Calibri"/>
       </w:rPr>
       <w:fldChar w:fldCharType="separate"/>
     </w:r>
     <w:r>
       <w:rPr>
         <w:rStyle w:val="PageNumber"/>
-        <w:rFonts w:ascii="Calibri" w:hAnsi="Calibri"/>
       </w:rPr>
       <w:t>3</w:t>
     </w:r>
     <w:r>
       <w:rPr>
         <w:rStyle w:val="PageNumber"/>
-        <w:rFonts w:ascii="Calibri" w:hAnsi="Calibri"/>
       </w:rPr>
       <w:fldChar w:fldCharType="end"/>
     </w:r>
     <w:r>
       <w:rPr>
         <w:rStyle w:val="PageNumber"/>
-        <w:rFonts w:ascii="Calibri" w:hAnsi="Calibri"/>
       </w:rPr>
       <w:t xml:space="preserve"> of </w:t>
     </w:r>
     <w:r>
       <w:rPr>
         <w:rStyle w:val="PageNumber"/>
-        <w:rFonts w:ascii="Calibri" w:hAnsi="Calibri"/>
       </w:rPr>
       <w:fldChar w:fldCharType="begin"/>
     </w:r>
     <w:r>
       <w:rPr>
         <w:rStyle w:val="PageNumber"/>
-        <w:rFonts w:ascii="Calibri" w:hAnsi="Calibri"/>
       </w:rPr>
       <w:instrText xml:space="preserve"> NUMPAGES </w:instrText>
     </w:r>
     <w:r>
       <w:rPr>
         <w:rStyle w:val="PageNumber"/>
-        <w:rFonts w:ascii="Calibri" w:hAnsi="Calibri"/>
       </w:rPr>
       <w:fldChar w:fldCharType="separate"/>
     </w:r>
     <w:r>
       <w:rPr>
         <w:rStyle w:val="PageNumber"/>
-        <w:rFonts w:ascii="Calibri" w:hAnsi="Calibri"/>
       </w:rPr>
-      <w:t>6</w:t>
+      <w:t>7</w:t>
     </w:r>
     <w:r>
       <w:rPr>
         <w:rStyle w:val="PageNumber"/>
-        <w:rFonts w:ascii="Calibri" w:hAnsi="Calibri"/>
       </w:rPr>
       <w:fldChar w:fldCharType="end"/>
     </w:r>
@@ -3379,85 +3356,72 @@
       <w:tab/>
     </w:r>
     <w:r>
-      <w:rPr>
-        <w:rFonts w:ascii="Calibri" w:hAnsi="Calibri"/>
-      </w:rPr>
+      <w:rPr/>
       <w:t xml:space="preserve">Page </w:t>
     </w:r>
     <w:r>
       <w:rPr>
         <w:rStyle w:val="PageNumber"/>
-        <w:rFonts w:ascii="Calibri" w:hAnsi="Calibri"/>
       </w:rPr>
       <w:fldChar w:fldCharType="begin"/>
     </w:r>
     <w:r>
       <w:rPr>
         <w:rStyle w:val="PageNumber"/>
-        <w:rFonts w:ascii="Calibri" w:hAnsi="Calibri"/>
       </w:rPr>
       <w:instrText xml:space="preserve"> PAGE </w:instrText>
     </w:r>
     <w:r>
       <w:rPr>
         <w:rStyle w:val="PageNumber"/>
-        <w:rFonts w:ascii="Calibri" w:hAnsi="Calibri"/>
       </w:rPr>
       <w:fldChar w:fldCharType="separate"/>
     </w:r>
     <w:r>
       <w:rPr>
         <w:rStyle w:val="PageNumber"/>
-        <w:rFonts w:ascii="Calibri" w:hAnsi="Calibri"/>
       </w:rPr>
-      <w:t>6</w:t>
+      <w:t>7</w:t>
     </w:r>
     <w:r>
       <w:rPr>
         <w:rStyle w:val="PageNumber"/>
-        <w:rFonts w:ascii="Calibri" w:hAnsi="Calibri"/>
       </w:rPr>
       <w:fldChar w:fldCharType="end"/>
     </w:r>
     <w:r>
       <w:rPr>
         <w:rStyle w:val="PageNumber"/>
-        <w:rFonts w:ascii="Calibri" w:hAnsi="Calibri"/>
       </w:rPr>
       <w:t xml:space="preserve"> of </w:t>
     </w:r>
     <w:r>
       <w:rPr>
         <w:rStyle w:val="PageNumber"/>
-        <w:rFonts w:ascii="Calibri" w:hAnsi="Calibri"/>
       </w:rPr>
       <w:fldChar w:fldCharType="begin"/>
     </w:r>
     <w:r>
       <w:rPr>
         <w:rStyle w:val="PageNumber"/>
-        <w:rFonts w:ascii="Calibri" w:hAnsi="Calibri"/>
       </w:rPr>
       <w:instrText xml:space="preserve"> NUMPAGES </w:instrText>
     </w:r>
     <w:r>
       <w:rPr>
         <w:rStyle w:val="PageNumber"/>
-        <w:rFonts w:ascii="Calibri" w:hAnsi="Calibri"/>
       </w:rPr>
       <w:fldChar w:fldCharType="separate"/>
     </w:r>
     <w:r>
       <w:rPr>
         <w:rStyle w:val="PageNumber"/>
-        <w:rFonts w:ascii="Calibri" w:hAnsi="Calibri"/>
       </w:rPr>
-      <w:t>6</w:t>
+      <w:t>7</w:t>
     </w:r>
     <w:r>
       <w:rPr>
         <w:rStyle w:val="PageNumber"/>
-        <w:rFonts w:ascii="Calibri" w:hAnsi="Calibri"/>
       </w:rPr>
       <w:fldChar w:fldCharType="end"/>
     </w:r>
@@ -3489,85 +3453,72 @@
       <w:tab/>
     </w:r>
     <w:r>
-      <w:rPr>
-        <w:rFonts w:ascii="Calibri" w:hAnsi="Calibri"/>
-      </w:rPr>
+      <w:rPr/>
       <w:t xml:space="preserve">Page </w:t>
     </w:r>
     <w:r>
       <w:rPr>
         <w:rStyle w:val="PageNumber"/>
-        <w:rFonts w:ascii="Calibri" w:hAnsi="Calibri"/>
       </w:rPr>
       <w:fldChar w:fldCharType="begin"/>
     </w:r>
     <w:r>
       <w:rPr>
         <w:rStyle w:val="PageNumber"/>
-        <w:rFonts w:ascii="Calibri" w:hAnsi="Calibri"/>
       </w:rPr>
       <w:instrText xml:space="preserve"> PAGE </w:instrText>
     </w:r>
     <w:r>
       <w:rPr>
         <w:rStyle w:val="PageNumber"/>
-        <w:rFonts w:ascii="Calibri" w:hAnsi="Calibri"/>
       </w:rPr>
       <w:fldChar w:fldCharType="separate"/>
     </w:r>
     <w:r>
       <w:rPr>
         <w:rStyle w:val="PageNumber"/>
-        <w:rFonts w:ascii="Calibri" w:hAnsi="Calibri"/>
       </w:rPr>
-      <w:t>6</w:t>
+      <w:t>7</w:t>
     </w:r>
     <w:r>
       <w:rPr>
         <w:rStyle w:val="PageNumber"/>
-        <w:rFonts w:ascii="Calibri" w:hAnsi="Calibri"/>
       </w:rPr>
       <w:fldChar w:fldCharType="end"/>
     </w:r>
     <w:r>
       <w:rPr>
         <w:rStyle w:val="PageNumber"/>
-        <w:rFonts w:ascii="Calibri" w:hAnsi="Calibri"/>
       </w:rPr>
       <w:t xml:space="preserve"> of </w:t>
     </w:r>
     <w:r>
       <w:rPr>
         <w:rStyle w:val="PageNumber"/>
-        <w:rFonts w:ascii="Calibri" w:hAnsi="Calibri"/>
       </w:rPr>
       <w:fldChar w:fldCharType="begin"/>
     </w:r>
     <w:r>
       <w:rPr>
         <w:rStyle w:val="PageNumber"/>
-        <w:rFonts w:ascii="Calibri" w:hAnsi="Calibri"/>
       </w:rPr>
       <w:instrText xml:space="preserve"> NUMPAGES </w:instrText>
     </w:r>
     <w:r>
       <w:rPr>
         <w:rStyle w:val="PageNumber"/>
-        <w:rFonts w:ascii="Calibri" w:hAnsi="Calibri"/>
       </w:rPr>
       <w:fldChar w:fldCharType="separate"/>
     </w:r>
     <w:r>
       <w:rPr>
         <w:rStyle w:val="PageNumber"/>
-        <w:rFonts w:ascii="Calibri" w:hAnsi="Calibri"/>
       </w:rPr>
-      <w:t>6</w:t>
+      <w:t>7</w:t>
     </w:r>
     <w:r>
       <w:rPr>
         <w:rStyle w:val="PageNumber"/>
-        <w:rFonts w:ascii="Calibri" w:hAnsi="Calibri"/>
       </w:rPr>
       <w:fldChar w:fldCharType="end"/>
     </w:r>
@@ -4281,17 +4232,18 @@
     <w:rsid w:val="004320ff"/>
     <w:pPr>
       <w:widowControl/>
+      <w:suppressAutoHyphens w:val="true"/>
       <w:bidi w:val="0"/>
       <w:spacing w:before="0" w:after="0"/>
       <w:jc w:val="start"/>
     </w:pPr>
     <w:rPr>
-      <w:rFonts w:ascii="Calibri" w:hAnsi="Calibri" w:cs="Calibri" w:asciiTheme="minorHAnsi" w:cstheme="minorHAnsi" w:hAnsiTheme="minorHAnsi" w:eastAsia="Times New Roman"/>
+      <w:rFonts w:ascii="Calibri" w:hAnsi="Calibri" w:eastAsia="Times New Roman" w:cs="Calibri" w:asciiTheme="minorHAnsi" w:cstheme="minorHAnsi" w:hAnsiTheme="minorHAnsi"/>
       <w:color w:val="auto"/>
       <w:kern w:val="0"/>
       <w:sz w:val="22"/>
       <w:szCs w:val="22"/>
-      <w:lang w:eastAsia="en-US" w:val="en-GB" w:bidi="ar-SA"/>
+      <w:lang w:val="en-GB" w:eastAsia="en-US" w:bidi="ar-SA"/>
     </w:rPr>
   </w:style>
   <w:style w:type="paragraph" w:styleId="Heading1">
@@ -5182,7 +5134,7 @@
     <w:qFormat/>
     <w:rsid w:val="00554b3d"/>
     <w:pPr>
-      <w:overflowPunct w:val="true"/>
+      <w:overflowPunct w:val="false"/>
     </w:pPr>
     <w:rPr>
       <w:rFonts w:ascii="Times New Roman" w:hAnsi="Times New Roman"/>
@@ -5237,6 +5189,7 @@
     <w:rsid w:val="008c0989"/>
     <w:pPr>
       <w:widowControl/>
+      <w:suppressAutoHyphens w:val="true"/>
       <w:bidi w:val="0"/>
       <w:spacing w:before="0" w:after="0"/>
       <w:jc w:val="start"/>
@@ -5404,7 +5357,6 @@
       </w:tcPr>
     </w:tblStylePr>
     <w:tblStylePr w:type="lastRow">
-      <w:rPr/>
       <w:tblPr/>
       <w:tcPr>
         <w:tcBorders>
@@ -5419,7 +5371,6 @@
       </w:tcPr>
     </w:tblStylePr>
     <w:tblStylePr w:type="firstCol">
-      <w:rPr/>
       <w:tblPr/>
       <w:tcPr>
         <w:tcBorders>
@@ -5434,7 +5385,6 @@
       </w:tcPr>
     </w:tblStylePr>
     <w:tblStylePr w:type="lastCol">
-      <w:rPr/>
       <w:tblPr/>
       <w:tcPr>
         <w:tcBorders>
@@ -5449,7 +5399,6 @@
       </w:tcPr>
     </w:tblStylePr>
     <w:tblStylePr w:type="band1Vert">
-      <w:rPr/>
       <w:tblPr/>
       <w:tcPr>
         <w:tcBorders>
@@ -5462,7 +5411,6 @@
       </w:tcPr>
     </w:tblStylePr>
     <w:tblStylePr w:type="band1Horz">
-      <w:rPr/>
       <w:tblPr/>
       <w:tcPr>
         <w:tcBorders>
@@ -5475,14 +5423,12 @@
       </w:tcPr>
     </w:tblStylePr>
     <w:tblStylePr w:type="nwCell">
-      <w:rPr/>
       <w:tblPr/>
       <w:tcPr>
         <w:shd w:val="clear" w:color="auto" w:fill="FFFFFF"/>
       </w:tcPr>
     </w:tblStylePr>
     <w:tblStylePr w:type="swCell">
-      <w:rPr/>
       <w:tblPr/>
       <w:tcPr>
         <w:tcBorders>
@@ -5525,7 +5471,6 @@
       </w:tcPr>
     </w:tblStylePr>
     <w:tblStylePr w:type="lastRow">
-      <w:rPr/>
       <w:tblPr/>
       <w:tcPr>
         <w:tcBorders>
@@ -5563,7 +5508,6 @@
       </w:tcPr>
     </w:tblStylePr>
     <w:tblStylePr w:type="swCell">
-      <w:rPr/>
       <w:tblPr/>
       <w:tcPr>
         <w:tcBorders>

</xml_diff>

<commit_message>
Created BC-DEV env, Add folder structure and initial configuration files for AL extension needed for Data Source
</commit_message>
<xml_diff>
--- a/docs/Software-Design-Document.docx
+++ b/docs/Software-Design-Document.docx
@@ -355,14 +355,14 @@
         <w:tblLook w:noHBand="0" w:noVBand="0" w:firstColumn="1" w:lastRow="0" w:lastColumn="0" w:firstRow="1" w:val="00a0"/>
       </w:tblPr>
       <w:tblGrid>
-        <w:gridCol w:w="2941"/>
-        <w:gridCol w:w="6304"/>
+        <w:gridCol w:w="2940"/>
+        <w:gridCol w:w="6305"/>
       </w:tblGrid>
       <w:tr>
         <w:trPr/>
         <w:tc>
           <w:tcPr>
-            <w:tcW w:w="2941" w:type="dxa"/>
+            <w:tcW w:w="2940" w:type="dxa"/>
             <w:tcBorders>
               <w:top w:val="single" w:sz="4" w:space="0" w:color="000000"/>
               <w:start w:val="single" w:sz="4" w:space="0" w:color="000000"/>
@@ -384,7 +384,7 @@
         </w:tc>
         <w:tc>
           <w:tcPr>
-            <w:tcW w:w="6304" w:type="dxa"/>
+            <w:tcW w:w="6305" w:type="dxa"/>
             <w:tcBorders>
               <w:top w:val="single" w:sz="4" w:space="0" w:color="000000"/>
               <w:start w:val="single" w:sz="4" w:space="0" w:color="000000"/>
@@ -409,7 +409,7 @@
         <w:trPr/>
         <w:tc>
           <w:tcPr>
-            <w:tcW w:w="2941" w:type="dxa"/>
+            <w:tcW w:w="2940" w:type="dxa"/>
             <w:tcBorders>
               <w:top w:val="single" w:sz="4" w:space="0" w:color="000000"/>
               <w:start w:val="single" w:sz="4" w:space="0" w:color="000000"/>
@@ -431,7 +431,7 @@
         </w:tc>
         <w:tc>
           <w:tcPr>
-            <w:tcW w:w="6304" w:type="dxa"/>
+            <w:tcW w:w="6305" w:type="dxa"/>
             <w:tcBorders>
               <w:top w:val="single" w:sz="4" w:space="0" w:color="000000"/>
               <w:start w:val="single" w:sz="4" w:space="0" w:color="000000"/>
@@ -456,7 +456,7 @@
         <w:trPr/>
         <w:tc>
           <w:tcPr>
-            <w:tcW w:w="2941" w:type="dxa"/>
+            <w:tcW w:w="2940" w:type="dxa"/>
             <w:tcBorders>
               <w:top w:val="single" w:sz="4" w:space="0" w:color="000000"/>
               <w:start w:val="single" w:sz="4" w:space="0" w:color="000000"/>
@@ -478,7 +478,7 @@
         </w:tc>
         <w:tc>
           <w:tcPr>
-            <w:tcW w:w="6304" w:type="dxa"/>
+            <w:tcW w:w="6305" w:type="dxa"/>
             <w:tcBorders>
               <w:top w:val="single" w:sz="4" w:space="0" w:color="000000"/>
               <w:start w:val="single" w:sz="4" w:space="0" w:color="000000"/>
@@ -503,7 +503,7 @@
         <w:trPr/>
         <w:tc>
           <w:tcPr>
-            <w:tcW w:w="2941" w:type="dxa"/>
+            <w:tcW w:w="2940" w:type="dxa"/>
             <w:tcBorders>
               <w:top w:val="single" w:sz="4" w:space="0" w:color="000000"/>
               <w:start w:val="single" w:sz="4" w:space="0" w:color="000000"/>
@@ -525,7 +525,7 @@
         </w:tc>
         <w:tc>
           <w:tcPr>
-            <w:tcW w:w="6304" w:type="dxa"/>
+            <w:tcW w:w="6305" w:type="dxa"/>
             <w:tcBorders>
               <w:top w:val="single" w:sz="4" w:space="0" w:color="000000"/>
               <w:start w:val="single" w:sz="4" w:space="0" w:color="000000"/>
@@ -1124,8 +1124,8 @@
         <w:tblLook w:noHBand="0" w:noVBand="0" w:firstColumn="0" w:lastRow="0" w:lastColumn="0" w:firstRow="0" w:val="0000"/>
       </w:tblPr>
       <w:tblGrid>
-        <w:gridCol w:w="2091"/>
-        <w:gridCol w:w="2128"/>
+        <w:gridCol w:w="2090"/>
+        <w:gridCol w:w="2129"/>
         <w:gridCol w:w="3119"/>
         <w:gridCol w:w="1860"/>
       </w:tblGrid>
@@ -1133,7 +1133,7 @@
         <w:trPr/>
         <w:tc>
           <w:tcPr>
-            <w:tcW w:w="2091" w:type="dxa"/>
+            <w:tcW w:w="2090" w:type="dxa"/>
             <w:tcBorders>
               <w:top w:val="single" w:sz="4" w:space="0" w:color="000000"/>
               <w:start w:val="single" w:sz="4" w:space="0" w:color="000000"/>
@@ -1155,7 +1155,7 @@
         </w:tc>
         <w:tc>
           <w:tcPr>
-            <w:tcW w:w="2128" w:type="dxa"/>
+            <w:tcW w:w="2129" w:type="dxa"/>
             <w:tcBorders>
               <w:top w:val="single" w:sz="4" w:space="0" w:color="000000"/>
               <w:start w:val="single" w:sz="4" w:space="0" w:color="000000"/>
@@ -1224,7 +1224,7 @@
         <w:trPr/>
         <w:tc>
           <w:tcPr>
-            <w:tcW w:w="2091" w:type="dxa"/>
+            <w:tcW w:w="2090" w:type="dxa"/>
             <w:tcBorders>
               <w:top w:val="single" w:sz="4" w:space="0" w:color="000000"/>
               <w:start w:val="single" w:sz="4" w:space="0" w:color="000000"/>
@@ -1245,7 +1245,7 @@
         </w:tc>
         <w:tc>
           <w:tcPr>
-            <w:tcW w:w="2128" w:type="dxa"/>
+            <w:tcW w:w="2129" w:type="dxa"/>
             <w:tcBorders>
               <w:top w:val="single" w:sz="4" w:space="0" w:color="000000"/>
               <w:start w:val="single" w:sz="4" w:space="0" w:color="000000"/>
@@ -1353,8 +1353,8 @@
       </w:tblPr>
       <w:tblGrid>
         <w:gridCol w:w="2093"/>
-        <w:gridCol w:w="2833"/>
-        <w:gridCol w:w="4254"/>
+        <w:gridCol w:w="2832"/>
+        <w:gridCol w:w="4255"/>
       </w:tblGrid>
       <w:tr>
         <w:trPr/>
@@ -1382,7 +1382,7 @@
         </w:tc>
         <w:tc>
           <w:tcPr>
-            <w:tcW w:w="2833" w:type="dxa"/>
+            <w:tcW w:w="2832" w:type="dxa"/>
             <w:tcBorders>
               <w:top w:val="single" w:sz="4" w:space="0" w:color="000000"/>
               <w:start w:val="single" w:sz="4" w:space="0" w:color="000000"/>
@@ -1404,7 +1404,7 @@
         </w:tc>
         <w:tc>
           <w:tcPr>
-            <w:tcW w:w="4254" w:type="dxa"/>
+            <w:tcW w:w="4255" w:type="dxa"/>
             <w:tcBorders>
               <w:top w:val="single" w:sz="4" w:space="0" w:color="000000"/>
               <w:start w:val="single" w:sz="4" w:space="0" w:color="000000"/>
@@ -1450,7 +1450,7 @@
         </w:tc>
         <w:tc>
           <w:tcPr>
-            <w:tcW w:w="2833" w:type="dxa"/>
+            <w:tcW w:w="2832" w:type="dxa"/>
             <w:tcBorders>
               <w:top w:val="single" w:sz="4" w:space="0" w:color="000000"/>
               <w:start w:val="single" w:sz="4" w:space="0" w:color="000000"/>
@@ -1471,7 +1471,7 @@
         </w:tc>
         <w:tc>
           <w:tcPr>
-            <w:tcW w:w="4254" w:type="dxa"/>
+            <w:tcW w:w="4255" w:type="dxa"/>
             <w:tcBorders>
               <w:top w:val="single" w:sz="4" w:space="0" w:color="000000"/>
               <w:start w:val="single" w:sz="4" w:space="0" w:color="000000"/>
@@ -2067,15 +2067,6 @@
       <w:r>
         <w:rPr/>
         <w:t>&lt;Not all of the following sections may be applicable to the work being performed. If so, the preference would be to keep the section heading, but make a note such as “This section is not applicable for this process” and provide an explanation for the reasons why&gt;</w:t>
-      </w:r>
-    </w:p>
-    <w:p>
-      <w:pPr>
-        <w:pStyle w:val="Normal"/>
-        <w:rPr/>
-      </w:pPr>
-      <w:r>
-        <w:rPr/>
       </w:r>
     </w:p>
     <w:p>
@@ -2643,8 +2634,8 @@
         <w:rPr/>
       </w:pPr>
       <w:bookmarkStart w:id="0" w:name="__RefHeading___Toc2654_579290053"/>
-      <w:bookmarkStart w:id="1" w:name="_Toc337656202"/>
-      <w:bookmarkStart w:id="2" w:name="_Toc239804408"/>
+      <w:bookmarkStart w:id="1" w:name="_Toc239804408"/>
+      <w:bookmarkStart w:id="2" w:name="_Toc337656202"/>
       <w:bookmarkEnd w:id="0"/>
       <w:r>
         <w:rPr/>
@@ -2713,8 +2704,8 @@
         <w:rPr/>
       </w:pPr>
       <w:bookmarkStart w:id="7" w:name="__RefHeading___Toc2660_579290053"/>
-      <w:bookmarkStart w:id="8" w:name="_Toc337656202_Copy_1"/>
-      <w:bookmarkStart w:id="9" w:name="_Toc239804408_Copy_1"/>
+      <w:bookmarkStart w:id="8" w:name="_Toc239804408_Copy_1"/>
+      <w:bookmarkStart w:id="9" w:name="_Toc337656202_Copy_1"/>
       <w:bookmarkEnd w:id="7"/>
       <w:bookmarkEnd w:id="8"/>
       <w:bookmarkEnd w:id="9"/>
@@ -2815,6 +2806,7 @@
     <w:p>
       <w:pPr>
         <w:pStyle w:val="Normal"/>
+        <w:spacing w:before="0" w:after="0"/>
         <w:rPr/>
       </w:pPr>
       <w:r>
@@ -2830,7 +2822,11 @@
       <w:bookmarkEnd w:id="11"/>
       <w:r>
         <w:rPr/>
-        <w:t>Logical Data Model</w:t>
+        <w:t xml:space="preserve">Logical Data </w:t>
+      </w:r>
+      <w:r>
+        <w:rPr/>
+        <w:t>Flow Diagram</w:t>
       </w:r>
     </w:p>
     <w:p>
@@ -2890,11 +2886,6 @@
                       <a:avLst/>
                     </a:prstGeom>
                     <a:noFill/>
-                    <a:ln>
-                      <a:solidFill>
-                        <a:srgbClr val="000000"/>
-                      </a:solidFill>
-                    </a:ln>
                   </pic:spPr>
                 </pic:pic>
               </a:graphicData>
@@ -3354,9 +3345,6 @@
       <w:rPr/>
       <w:t>Status: &lt;Draft/Released For Approval/Approved&gt;</w:t>
       <w:tab/>
-    </w:r>
-    <w:r>
-      <w:rPr/>
       <w:t xml:space="preserve">Page </w:t>
     </w:r>
     <w:r>
@@ -3451,9 +3439,6 @@
       <w:rPr/>
       <w:t>Status: &lt;Draft/Released For Approval/Approved&gt;</w:t>
       <w:tab/>
-    </w:r>
-    <w:r>
-      <w:rPr/>
       <w:t xml:space="preserve">Page </w:t>
     </w:r>
     <w:r>
@@ -5134,7 +5119,7 @@
     <w:qFormat/>
     <w:rsid w:val="00554b3d"/>
     <w:pPr>
-      <w:overflowPunct w:val="false"/>
+      <w:overflowPunct w:val="true"/>
     </w:pPr>
     <w:rPr>
       <w:rFonts w:ascii="Times New Roman" w:hAnsi="Times New Roman"/>

</xml_diff>

<commit_message>
Add Business Central integration with API client and configuration
- Implemented BusinessCentralClient and IBusinessCentralClient for API interactions.
- Added BusinessCentralOptions for configuration settings.
- Updated Program.cs to configure HTTP client and Swagger for API documentation.
- Enhanced appsettings.Development.json with Business Central connection details.
- Updated .gitignore to exclude sensitive files and temporary lock files.
- Added VendorDTO and BusinessCentralResponse classes for data handling.
- Enhanced VendorAPI.page.al with additional fields for payment terms and vendor posting group.
</commit_message>
<xml_diff>
--- a/docs/Software-Design-Document.docx
+++ b/docs/Software-Design-Document.docx
@@ -355,14 +355,14 @@
         <w:tblLook w:noHBand="0" w:noVBand="0" w:firstColumn="1" w:lastRow="0" w:lastColumn="0" w:firstRow="1" w:val="00a0"/>
       </w:tblPr>
       <w:tblGrid>
-        <w:gridCol w:w="2940"/>
-        <w:gridCol w:w="6305"/>
+        <w:gridCol w:w="2939"/>
+        <w:gridCol w:w="6306"/>
       </w:tblGrid>
       <w:tr>
         <w:trPr/>
         <w:tc>
           <w:tcPr>
-            <w:tcW w:w="2940" w:type="dxa"/>
+            <w:tcW w:w="2939" w:type="dxa"/>
             <w:tcBorders>
               <w:top w:val="single" w:sz="4" w:space="0" w:color="000000"/>
               <w:start w:val="single" w:sz="4" w:space="0" w:color="000000"/>
@@ -384,7 +384,7 @@
         </w:tc>
         <w:tc>
           <w:tcPr>
-            <w:tcW w:w="6305" w:type="dxa"/>
+            <w:tcW w:w="6306" w:type="dxa"/>
             <w:tcBorders>
               <w:top w:val="single" w:sz="4" w:space="0" w:color="000000"/>
               <w:start w:val="single" w:sz="4" w:space="0" w:color="000000"/>
@@ -409,7 +409,7 @@
         <w:trPr/>
         <w:tc>
           <w:tcPr>
-            <w:tcW w:w="2940" w:type="dxa"/>
+            <w:tcW w:w="2939" w:type="dxa"/>
             <w:tcBorders>
               <w:top w:val="single" w:sz="4" w:space="0" w:color="000000"/>
               <w:start w:val="single" w:sz="4" w:space="0" w:color="000000"/>
@@ -431,7 +431,7 @@
         </w:tc>
         <w:tc>
           <w:tcPr>
-            <w:tcW w:w="6305" w:type="dxa"/>
+            <w:tcW w:w="6306" w:type="dxa"/>
             <w:tcBorders>
               <w:top w:val="single" w:sz="4" w:space="0" w:color="000000"/>
               <w:start w:val="single" w:sz="4" w:space="0" w:color="000000"/>
@@ -456,7 +456,7 @@
         <w:trPr/>
         <w:tc>
           <w:tcPr>
-            <w:tcW w:w="2940" w:type="dxa"/>
+            <w:tcW w:w="2939" w:type="dxa"/>
             <w:tcBorders>
               <w:top w:val="single" w:sz="4" w:space="0" w:color="000000"/>
               <w:start w:val="single" w:sz="4" w:space="0" w:color="000000"/>
@@ -478,7 +478,7 @@
         </w:tc>
         <w:tc>
           <w:tcPr>
-            <w:tcW w:w="6305" w:type="dxa"/>
+            <w:tcW w:w="6306" w:type="dxa"/>
             <w:tcBorders>
               <w:top w:val="single" w:sz="4" w:space="0" w:color="000000"/>
               <w:start w:val="single" w:sz="4" w:space="0" w:color="000000"/>
@@ -503,7 +503,7 @@
         <w:trPr/>
         <w:tc>
           <w:tcPr>
-            <w:tcW w:w="2940" w:type="dxa"/>
+            <w:tcW w:w="2939" w:type="dxa"/>
             <w:tcBorders>
               <w:top w:val="single" w:sz="4" w:space="0" w:color="000000"/>
               <w:start w:val="single" w:sz="4" w:space="0" w:color="000000"/>
@@ -525,7 +525,7 @@
         </w:tc>
         <w:tc>
           <w:tcPr>
-            <w:tcW w:w="6305" w:type="dxa"/>
+            <w:tcW w:w="6306" w:type="dxa"/>
             <w:tcBorders>
               <w:top w:val="single" w:sz="4" w:space="0" w:color="000000"/>
               <w:start w:val="single" w:sz="4" w:space="0" w:color="000000"/>
@@ -1124,8 +1124,8 @@
         <w:tblLook w:noHBand="0" w:noVBand="0" w:firstColumn="0" w:lastRow="0" w:lastColumn="0" w:firstRow="0" w:val="0000"/>
       </w:tblPr>
       <w:tblGrid>
-        <w:gridCol w:w="2090"/>
-        <w:gridCol w:w="2129"/>
+        <w:gridCol w:w="2089"/>
+        <w:gridCol w:w="2130"/>
         <w:gridCol w:w="3119"/>
         <w:gridCol w:w="1860"/>
       </w:tblGrid>
@@ -1133,7 +1133,7 @@
         <w:trPr/>
         <w:tc>
           <w:tcPr>
-            <w:tcW w:w="2090" w:type="dxa"/>
+            <w:tcW w:w="2089" w:type="dxa"/>
             <w:tcBorders>
               <w:top w:val="single" w:sz="4" w:space="0" w:color="000000"/>
               <w:start w:val="single" w:sz="4" w:space="0" w:color="000000"/>
@@ -1155,7 +1155,7 @@
         </w:tc>
         <w:tc>
           <w:tcPr>
-            <w:tcW w:w="2129" w:type="dxa"/>
+            <w:tcW w:w="2130" w:type="dxa"/>
             <w:tcBorders>
               <w:top w:val="single" w:sz="4" w:space="0" w:color="000000"/>
               <w:start w:val="single" w:sz="4" w:space="0" w:color="000000"/>
@@ -1224,7 +1224,7 @@
         <w:trPr/>
         <w:tc>
           <w:tcPr>
-            <w:tcW w:w="2090" w:type="dxa"/>
+            <w:tcW w:w="2089" w:type="dxa"/>
             <w:tcBorders>
               <w:top w:val="single" w:sz="4" w:space="0" w:color="000000"/>
               <w:start w:val="single" w:sz="4" w:space="0" w:color="000000"/>
@@ -1245,7 +1245,7 @@
         </w:tc>
         <w:tc>
           <w:tcPr>
-            <w:tcW w:w="2129" w:type="dxa"/>
+            <w:tcW w:w="2130" w:type="dxa"/>
             <w:tcBorders>
               <w:top w:val="single" w:sz="4" w:space="0" w:color="000000"/>
               <w:start w:val="single" w:sz="4" w:space="0" w:color="000000"/>
@@ -2067,15 +2067,6 @@
       <w:r>
         <w:rPr/>
         <w:t>&lt;Not all of the following sections may be applicable to the work being performed. If so, the preference would be to keep the section heading, but make a note such as “This section is not applicable for this process” and provide an explanation for the reasons why&gt;</w:t>
-      </w:r>
-    </w:p>
-    <w:p>
-      <w:pPr>
-        <w:pStyle w:val="Normal"/>
-        <w:rPr/>
-      </w:pPr>
-      <w:r>
-        <w:rPr/>
       </w:r>
     </w:p>
     <w:p>
@@ -2634,8 +2625,8 @@
         <w:rPr/>
       </w:pPr>
       <w:bookmarkStart w:id="0" w:name="__RefHeading___Toc2654_579290053"/>
-      <w:bookmarkStart w:id="1" w:name="_Toc239804408"/>
-      <w:bookmarkStart w:id="2" w:name="_Toc337656202"/>
+      <w:bookmarkStart w:id="1" w:name="_Toc337656202"/>
+      <w:bookmarkStart w:id="2" w:name="_Toc239804408"/>
       <w:bookmarkEnd w:id="0"/>
       <w:r>
         <w:rPr/>
@@ -2704,8 +2695,8 @@
         <w:rPr/>
       </w:pPr>
       <w:bookmarkStart w:id="7" w:name="__RefHeading___Toc2660_579290053"/>
-      <w:bookmarkStart w:id="8" w:name="_Toc239804408_Copy_1"/>
-      <w:bookmarkStart w:id="9" w:name="_Toc337656202_Copy_1"/>
+      <w:bookmarkStart w:id="8" w:name="_Toc337656202_Copy_1"/>
+      <w:bookmarkStart w:id="9" w:name="_Toc239804408_Copy_1"/>
       <w:bookmarkEnd w:id="7"/>
       <w:bookmarkEnd w:id="8"/>
       <w:bookmarkEnd w:id="9"/>
@@ -2822,11 +2813,7 @@
       <w:bookmarkEnd w:id="11"/>
       <w:r>
         <w:rPr/>
-        <w:t xml:space="preserve">Logical Data </w:t>
-      </w:r>
-      <w:r>
-        <w:rPr/>
-        <w:t>Flow Diagram</w:t>
+        <w:t>Logical Data Flow Diagram</w:t>
       </w:r>
     </w:p>
     <w:p>
@@ -2973,6 +2960,24 @@
       <w:r>
         <w:rPr/>
         <w:t>Endpoints</w:t>
+      </w:r>
+    </w:p>
+    <w:p>
+      <w:pPr>
+        <w:pStyle w:val="Normal"/>
+        <w:rPr/>
+      </w:pPr>
+      <w:r>
+        <w:rPr/>
+      </w:r>
+    </w:p>
+    <w:p>
+      <w:pPr>
+        <w:pStyle w:val="Normal"/>
+        <w:rPr/>
+      </w:pPr>
+      <w:r>
+        <w:rPr/>
       </w:r>
     </w:p>
     <w:p>
@@ -5119,7 +5124,7 @@
     <w:qFormat/>
     <w:rsid w:val="00554b3d"/>
     <w:pPr>
-      <w:overflowPunct w:val="true"/>
+      <w:overflowPunct w:val="false"/>
     </w:pPr>
     <w:rPr>
       <w:rFonts w:ascii="Times New Roman" w:hAnsi="Times New Roman"/>

</xml_diff>